<commit_message>
Remove extra line breaks in assessment objectives
</commit_message>
<xml_diff>
--- a/CMMC Level 1 SSP Template NIST.docx
+++ b/CMMC Level 1 SSP Template NIST.docx
@@ -4504,33 +4504,7 @@
           <w:sz w:val="23"/>
           <w:szCs w:val="23"/>
         </w:rPr>
-        <w:t>3.1.2.a the types of transactions and functions that authorized users are permitted to</w:t>
-      </w:r>
-    </w:p>
-    <w:p>
-      <w:pPr>
-        <w:pStyle w:val="Normal"/>
-        <w:tabs>
-          <w:tab w:val="clear" w:pos="709"/>
-          <w:tab w:val="left" w:pos="540" w:leader="none"/>
-        </w:tabs>
-        <w:bidi w:val="0"/>
-        <w:jc w:val="start"/>
-        <w:rPr>
-          <w:color w:val="000000"/>
-          <w:sz w:val="23"/>
-          <w:szCs w:val="23"/>
-        </w:rPr>
-      </w:pPr>
-      <w:r>
-        <w:rPr>
-          <w:b w:val="false"/>
-          <w:bCs w:val="false"/>
-          <w:color w:val="000000"/>
-          <w:sz w:val="23"/>
-          <w:szCs w:val="23"/>
-        </w:rPr>
-        <w:t>execute are defined.</w:t>
+        <w:t>3.1.2.a the types of transactions and functions that authorized users are permitted to execute are defined.</w:t>
       </w:r>
     </w:p>
     <w:tbl>
@@ -4907,33 +4881,7 @@
           <w:sz w:val="23"/>
           <w:szCs w:val="23"/>
         </w:rPr>
-        <w:t>3.1.2.b system access is limited to the defined types of transactions and functions for</w:t>
-      </w:r>
-    </w:p>
-    <w:p>
-      <w:pPr>
-        <w:pStyle w:val="Normal"/>
-        <w:tabs>
-          <w:tab w:val="clear" w:pos="709"/>
-          <w:tab w:val="left" w:pos="540" w:leader="none"/>
-        </w:tabs>
-        <w:bidi w:val="0"/>
-        <w:jc w:val="start"/>
-        <w:rPr>
-          <w:color w:val="000000"/>
-          <w:sz w:val="23"/>
-          <w:szCs w:val="23"/>
-        </w:rPr>
-      </w:pPr>
-      <w:r>
-        <w:rPr>
-          <w:b w:val="false"/>
-          <w:bCs w:val="false"/>
-          <w:color w:val="000000"/>
-          <w:sz w:val="23"/>
-          <w:szCs w:val="23"/>
-        </w:rPr>
-        <w:t>authorized users.</w:t>
+        <w:t>3.1.2.b system access is limited to the defined types of transactions and functions for authorized users.</w:t>
       </w:r>
     </w:p>
     <w:tbl>
@@ -7670,33 +7618,7 @@
           <w:sz w:val="23"/>
           <w:szCs w:val="23"/>
         </w:rPr>
-        <w:t>3.1.22.a individuals authorized to post or process information on publicly accessible</w:t>
-      </w:r>
-    </w:p>
-    <w:p>
-      <w:pPr>
-        <w:pStyle w:val="Normal"/>
-        <w:tabs>
-          <w:tab w:val="clear" w:pos="709"/>
-          <w:tab w:val="left" w:pos="540" w:leader="none"/>
-        </w:tabs>
-        <w:bidi w:val="0"/>
-        <w:jc w:val="start"/>
-        <w:rPr>
-          <w:color w:val="000000"/>
-          <w:sz w:val="23"/>
-          <w:szCs w:val="23"/>
-        </w:rPr>
-      </w:pPr>
-      <w:r>
-        <w:rPr>
-          <w:b w:val="false"/>
-          <w:bCs w:val="false"/>
-          <w:color w:val="000000"/>
-          <w:sz w:val="23"/>
-          <w:szCs w:val="23"/>
-        </w:rPr>
-        <w:t>systems are identified.</w:t>
+        <w:t>3.1.22.a individuals authorized to post or process information on publicly accessible systems are identified.</w:t>
       </w:r>
     </w:p>
     <w:tbl>
@@ -8073,33 +7995,7 @@
           <w:sz w:val="23"/>
           <w:szCs w:val="23"/>
         </w:rPr>
-        <w:t>3.1.22.b procedures to ensure FCI is not posted or processed on publicly accessible</w:t>
-      </w:r>
-    </w:p>
-    <w:p>
-      <w:pPr>
-        <w:pStyle w:val="Normal"/>
-        <w:tabs>
-          <w:tab w:val="clear" w:pos="709"/>
-          <w:tab w:val="left" w:pos="540" w:leader="none"/>
-        </w:tabs>
-        <w:bidi w:val="0"/>
-        <w:jc w:val="start"/>
-        <w:rPr>
-          <w:color w:val="000000"/>
-          <w:sz w:val="23"/>
-          <w:szCs w:val="23"/>
-        </w:rPr>
-      </w:pPr>
-      <w:r>
-        <w:rPr>
-          <w:b w:val="false"/>
-          <w:bCs w:val="false"/>
-          <w:color w:val="000000"/>
-          <w:sz w:val="23"/>
-          <w:szCs w:val="23"/>
-        </w:rPr>
-        <w:t>systems are identified.</w:t>
+        <w:t>3.1.22.b procedures to ensure FCI is not posted or processed on publicly accessible systems are identified.</w:t>
       </w:r>
     </w:p>
     <w:tbl>
@@ -8476,33 +8372,7 @@
           <w:sz w:val="23"/>
           <w:szCs w:val="23"/>
         </w:rPr>
-        <w:t>3.1.22.c a review process is in place prior to posting of any content to publicly</w:t>
-      </w:r>
-    </w:p>
-    <w:p>
-      <w:pPr>
-        <w:pStyle w:val="Normal"/>
-        <w:tabs>
-          <w:tab w:val="clear" w:pos="709"/>
-          <w:tab w:val="left" w:pos="540" w:leader="none"/>
-        </w:tabs>
-        <w:bidi w:val="0"/>
-        <w:jc w:val="start"/>
-        <w:rPr>
-          <w:color w:val="000000"/>
-          <w:sz w:val="23"/>
-          <w:szCs w:val="23"/>
-        </w:rPr>
-      </w:pPr>
-      <w:r>
-        <w:rPr>
-          <w:b w:val="false"/>
-          <w:bCs w:val="false"/>
-          <w:color w:val="000000"/>
-          <w:sz w:val="23"/>
-          <w:szCs w:val="23"/>
-        </w:rPr>
-        <w:t>accessible systems.</w:t>
+        <w:t>3.1.22.c a review process is in place prior to posting of any content to publicly accessible systems.</w:t>
       </w:r>
     </w:p>
     <w:tbl>
@@ -8879,33 +8749,7 @@
           <w:sz w:val="23"/>
           <w:szCs w:val="23"/>
         </w:rPr>
-        <w:t>3.1.22.d content on publicly accessible systems is reviewed to ensure that it does not</w:t>
-      </w:r>
-    </w:p>
-    <w:p>
-      <w:pPr>
-        <w:pStyle w:val="Normal"/>
-        <w:tabs>
-          <w:tab w:val="clear" w:pos="709"/>
-          <w:tab w:val="left" w:pos="540" w:leader="none"/>
-        </w:tabs>
-        <w:bidi w:val="0"/>
-        <w:jc w:val="start"/>
-        <w:rPr>
-          <w:color w:val="000000"/>
-          <w:sz w:val="23"/>
-          <w:szCs w:val="23"/>
-        </w:rPr>
-      </w:pPr>
-      <w:r>
-        <w:rPr>
-          <w:b w:val="false"/>
-          <w:bCs w:val="false"/>
-          <w:color w:val="000000"/>
-          <w:sz w:val="23"/>
-          <w:szCs w:val="23"/>
-        </w:rPr>
-        <w:t>include FCI.</w:t>
+        <w:t>3.1.22.d content on publicly accessible systems is reviewed to ensure that it does not include FCI.</w:t>
       </w:r>
     </w:p>
     <w:tbl>
@@ -10947,33 +10791,7 @@
           <w:sz w:val="23"/>
           <w:szCs w:val="20"/>
         </w:rPr>
-        <w:t>3.5.2.a the identity of each user is authenticated or verified as a prerequisite to system</w:t>
-      </w:r>
-    </w:p>
-    <w:p>
-      <w:pPr>
-        <w:pStyle w:val="Normal"/>
-        <w:tabs>
-          <w:tab w:val="clear" w:pos="709"/>
-          <w:tab w:val="left" w:pos="540" w:leader="none"/>
-        </w:tabs>
-        <w:bidi w:val="0"/>
-        <w:jc w:val="start"/>
-        <w:rPr>
-          <w:color w:val="000000"/>
-          <w:sz w:val="23"/>
-          <w:szCs w:val="23"/>
-        </w:rPr>
-      </w:pPr>
-      <w:r>
-        <w:rPr>
-          <w:b w:val="false"/>
-          <w:bCs w:val="false"/>
-          <w:color w:val="000000"/>
-          <w:sz w:val="23"/>
-          <w:szCs w:val="20"/>
-        </w:rPr>
-        <w:t>access.</w:t>
+        <w:t>3.5.2.a the identity of each user is authenticated or verified as a prerequisite to system access.</w:t>
       </w:r>
     </w:p>
     <w:tbl>
@@ -11350,33 +11168,7 @@
           <w:sz w:val="23"/>
           <w:szCs w:val="20"/>
         </w:rPr>
-        <w:t>3.5.2.b the identity of each process acting on behalf of a user is authenticated or</w:t>
-      </w:r>
-    </w:p>
-    <w:p>
-      <w:pPr>
-        <w:pStyle w:val="Normal"/>
-        <w:tabs>
-          <w:tab w:val="clear" w:pos="709"/>
-          <w:tab w:val="left" w:pos="540" w:leader="none"/>
-        </w:tabs>
-        <w:bidi w:val="0"/>
-        <w:jc w:val="start"/>
-        <w:rPr>
-          <w:color w:val="000000"/>
-          <w:sz w:val="23"/>
-          <w:szCs w:val="23"/>
-        </w:rPr>
-      </w:pPr>
-      <w:r>
-        <w:rPr>
-          <w:b w:val="false"/>
-          <w:bCs w:val="false"/>
-          <w:color w:val="000000"/>
-          <w:sz w:val="23"/>
-          <w:szCs w:val="20"/>
-        </w:rPr>
-        <w:t>verified as a prerequisite to system access.</w:t>
+        <w:t>3.5.2.b the identity of each process acting on behalf of a user is authenticated or verified as a prerequisite to system access.</w:t>
       </w:r>
     </w:p>
     <w:tbl>
@@ -11753,33 +11545,7 @@
           <w:sz w:val="23"/>
           <w:szCs w:val="20"/>
         </w:rPr>
-        <w:t>3.5.2.c the identity of each device accessing or connecting to the system is</w:t>
-      </w:r>
-    </w:p>
-    <w:p>
-      <w:pPr>
-        <w:pStyle w:val="Normal"/>
-        <w:tabs>
-          <w:tab w:val="clear" w:pos="709"/>
-          <w:tab w:val="left" w:pos="540" w:leader="none"/>
-        </w:tabs>
-        <w:bidi w:val="0"/>
-        <w:jc w:val="start"/>
-        <w:rPr>
-          <w:color w:val="000000"/>
-          <w:sz w:val="23"/>
-          <w:szCs w:val="23"/>
-        </w:rPr>
-      </w:pPr>
-      <w:r>
-        <w:rPr>
-          <w:b w:val="false"/>
-          <w:bCs w:val="false"/>
-          <w:color w:val="000000"/>
-          <w:sz w:val="23"/>
-          <w:szCs w:val="20"/>
-        </w:rPr>
-        <w:t>authenticated or verified as a prerequisite to system access.</w:t>
+        <w:t>3.5.2.c the identity of each device accessing or connecting to the system is authenticated or verified as a prerequisite to system access.</w:t>
       </w:r>
     </w:p>
     <w:tbl>
@@ -20514,33 +20280,7 @@
           <w:sz w:val="23"/>
           <w:szCs w:val="20"/>
         </w:rPr>
-        <w:t>3.13.5.b subnetworks for publicly accessible system components are physically or</w:t>
-      </w:r>
-    </w:p>
-    <w:p>
-      <w:pPr>
-        <w:pStyle w:val="Normal"/>
-        <w:tabs>
-          <w:tab w:val="clear" w:pos="709"/>
-          <w:tab w:val="left" w:pos="540" w:leader="none"/>
-        </w:tabs>
-        <w:bidi w:val="0"/>
-        <w:jc w:val="start"/>
-        <w:rPr>
-          <w:color w:val="000000"/>
-          <w:sz w:val="23"/>
-          <w:szCs w:val="23"/>
-        </w:rPr>
-      </w:pPr>
-      <w:r>
-        <w:rPr>
-          <w:b w:val="false"/>
-          <w:bCs w:val="false"/>
-          <w:color w:val="000000"/>
-          <w:sz w:val="23"/>
-          <w:szCs w:val="20"/>
-        </w:rPr>
-        <w:t>logically separated from internal networks</w:t>
+        <w:t>3.13.5.b subnetworks for publicly accessible system components are physically or logically separated from internal networks</w:t>
       </w:r>
     </w:p>
     <w:tbl>
@@ -25588,33 +25328,7 @@
           <w:sz w:val="23"/>
           <w:szCs w:val="20"/>
         </w:rPr>
-        <w:t>3.14.5.c real-time malicious code scans of files from external sources as files are</w:t>
-      </w:r>
-    </w:p>
-    <w:p>
-      <w:pPr>
-        <w:pStyle w:val="Normal"/>
-        <w:tabs>
-          <w:tab w:val="clear" w:pos="709"/>
-          <w:tab w:val="left" w:pos="540" w:leader="none"/>
-        </w:tabs>
-        <w:bidi w:val="0"/>
-        <w:jc w:val="start"/>
-        <w:rPr>
-          <w:color w:val="000000"/>
-          <w:sz w:val="23"/>
-          <w:szCs w:val="23"/>
-        </w:rPr>
-      </w:pPr>
-      <w:r>
-        <w:rPr>
-          <w:b w:val="false"/>
-          <w:bCs w:val="false"/>
-          <w:color w:val="000000"/>
-          <w:sz w:val="23"/>
-          <w:szCs w:val="20"/>
-        </w:rPr>
-        <w:t>downloaded, opened, or executed are performed.</w:t>
+        <w:t>3.14.5.c real-time malicious code scans of files from external sources as files are downloaded, opened, or executed are performed.</w:t>
       </w:r>
     </w:p>
     <w:tbl>

</xml_diff>